<commit_message>
Deepen Vertex + Thermo Fisher detail; flesh out Personal page
- Vertex: SCADA search/eval/selection→deploy/validate for CGT; ontology/semantics layer; industrial DataOps for AI readiness/data enablement; full-lifecycle ownership
- Thermo Fisher: integration-gap closure + AD onboarding; self-service automation support apps + issue/resolution tracker; facility-wide alarm management + centralized batch reporting; eBR vendor evaluation; first operating-company/lifecycle framing
- Synced both web résumé and the downloadable Word résumé
- Personal: WineApp sommelier blurb; interests (sailing, golf, rock climbing, gardening, personal sites)

Co-Authored-By: Claude Opus 4.8 <noreply@anthropic.com>
</commit_message>
<xml_diff>
--- a/resume/files/Martin-Kockx-Resume.docx
+++ b/resume/files/Martin-Kockx-Resume.docx
@@ -57,7 +57,7 @@
         </w:rPr>
         <w:t xml:space="preserve">  |  (857) 303-5412  |  </w:t>
       </w:r>
-      <w:hyperlink w:history="1" r:id="rIdn6fsh6m6lzzkwggxzam55">
+      <w:hyperlink w:history="1" r:id="rIdm2b5we-4qab5frrrqlgtw">
         <w:r>
           <w:rPr>
             <w:color w:val="0E5C5B"/>
@@ -75,7 +75,7 @@
         </w:rPr>
         <w:t xml:space="preserve">  |  </w:t>
       </w:r>
-      <w:hyperlink w:history="1" r:id="rIdym4ojoitgofzljpdnrltj">
+      <w:hyperlink w:history="1" r:id="rId2zwjksai1i2csomyx4fix">
         <w:r>
           <w:rPr>
             <w:color w:val="0E5C5B"/>
@@ -93,7 +93,7 @@
         </w:rPr>
         <w:t xml:space="preserve">  |  </w:t>
       </w:r>
-      <w:hyperlink w:history="1" r:id="rIdebidpcgq6qawysrunl3sn">
+      <w:hyperlink w:history="1" r:id="rIdoglwzgr_yzhl3-vebtnzo">
         <w:r>
           <w:rPr>
             <w:color w:val="0E5C5B"/>
@@ -380,61 +380,79 @@
           <w:sz w:val="20"/>
           <w:szCs w:val="20"/>
         </w:rPr>
-        <w:t xml:space="preserve">Partner with manufacturing and technology leadership to set smart-manufacturing strategy and roadmap across the manufacturing systems portfolio.</w:t>
-      </w:r>
-    </w:p>
-    <w:p>
-      <w:pPr>
-        <w:pStyle w:val="ListParagraph"/>
-        <w:numPr>
-          <w:ilvl w:val="0"/>
-          <w:numId w:val="2"/>
-        </w:numPr>
-        <w:spacing w:after="20"/>
-      </w:pPr>
-      <w:r>
-        <w:rPr>
-          <w:color w:val="1C1B19"/>
-          <w:sz w:val="20"/>
-          <w:szCs w:val="20"/>
-        </w:rPr>
-        <w:t xml:space="preserve">Define the data architecture and governance that make manufacturing data AI-ready; prioritize and shepherd AI use cases from concept to governed deployment.</w:t>
-      </w:r>
-    </w:p>
-    <w:p>
-      <w:pPr>
-        <w:pStyle w:val="ListParagraph"/>
-        <w:numPr>
-          <w:ilvl w:val="0"/>
-          <w:numId w:val="2"/>
-        </w:numPr>
-        <w:spacing w:after="20"/>
-      </w:pPr>
-      <w:r>
-        <w:rPr>
-          <w:color w:val="1C1B19"/>
-          <w:sz w:val="20"/>
-          <w:szCs w:val="20"/>
-        </w:rPr>
-        <w:t xml:space="preserve">Lead evaluation, selection, implementation, and lifecycle management of manufacturing systems, and manage strategic vendor relationships.</w:t>
-      </w:r>
-    </w:p>
-    <w:p>
-      <w:pPr>
-        <w:pStyle w:val="ListParagraph"/>
-        <w:numPr>
-          <w:ilvl w:val="0"/>
-          <w:numId w:val="2"/>
-        </w:numPr>
-        <w:spacing w:after="20"/>
-      </w:pPr>
-      <w:r>
-        <w:rPr>
-          <w:color w:val="1C1B19"/>
-          <w:sz w:val="20"/>
-          <w:szCs w:val="20"/>
-        </w:rPr>
-        <w:t xml:space="preserve">Ensure solutions meet GxP, data-integrity, and computer-system-lifecycle requirements (21 CFR Part 11, EU Annex 11, GAMP 5).</w:t>
+        <w:t xml:space="preserve">Own the full lifecycle of manufacturing systems and partner with manufacturing and technology leadership to set smart-manufacturing strategy and roadmap.</w:t>
+      </w:r>
+    </w:p>
+    <w:p>
+      <w:pPr>
+        <w:pStyle w:val="ListParagraph"/>
+        <w:numPr>
+          <w:ilvl w:val="0"/>
+          <w:numId w:val="2"/>
+        </w:numPr>
+        <w:spacing w:after="20"/>
+      </w:pPr>
+      <w:r>
+        <w:rPr>
+          <w:color w:val="1C1B19"/>
+          <w:sz w:val="20"/>
+          <w:szCs w:val="20"/>
+        </w:rPr>
+        <w:t xml:space="preserve">Led the search, evaluation, selection, and the deployment, implementation, and validation of a new SCADA system for the Cell &amp; Gene Therapy (CGT) department.</w:t>
+      </w:r>
+    </w:p>
+    <w:p>
+      <w:pPr>
+        <w:pStyle w:val="ListParagraph"/>
+        <w:numPr>
+          <w:ilvl w:val="0"/>
+          <w:numId w:val="2"/>
+        </w:numPr>
+        <w:spacing w:after="20"/>
+      </w:pPr>
+      <w:r>
+        <w:rPr>
+          <w:color w:val="1C1B19"/>
+          <w:sz w:val="20"/>
+          <w:szCs w:val="20"/>
+        </w:rPr>
+        <w:t xml:space="preserve">Drive manufacturing ontology and the knowledge / semantics layer, plus industrial DataOps investigations, to advance AI readiness, data enablement, and the next phase of the digitization journey.</w:t>
+      </w:r>
+    </w:p>
+    <w:p>
+      <w:pPr>
+        <w:pStyle w:val="ListParagraph"/>
+        <w:numPr>
+          <w:ilvl w:val="0"/>
+          <w:numId w:val="2"/>
+        </w:numPr>
+        <w:spacing w:after="20"/>
+      </w:pPr>
+      <w:r>
+        <w:rPr>
+          <w:color w:val="1C1B19"/>
+          <w:sz w:val="20"/>
+          <w:szCs w:val="20"/>
+        </w:rPr>
+        <w:t xml:space="preserve">Partner with manufacturing, engineering, and quality leaders toward commercial readiness; contribute to batch disposition and related initiatives.</w:t>
+      </w:r>
+    </w:p>
+    <w:p>
+      <w:pPr>
+        <w:pStyle w:val="ListParagraph"/>
+        <w:numPr>
+          <w:ilvl w:val="0"/>
+          <w:numId w:val="2"/>
+        </w:numPr>
+        <w:spacing w:after="20"/>
+      </w:pPr>
+      <w:r>
+        <w:rPr>
+          <w:color w:val="1C1B19"/>
+          <w:sz w:val="20"/>
+          <w:szCs w:val="20"/>
+        </w:rPr>
+        <w:t xml:space="preserve">Ensure GxP, data-integrity, and computer-system-lifecycle compliance (21 CFR Part 11, EU Annex 11, GAMP 5).</w:t>
       </w:r>
     </w:p>
     <w:p>
@@ -606,43 +624,79 @@
           <w:sz w:val="20"/>
           <w:szCs w:val="20"/>
         </w:rPr>
-        <w:t xml:space="preserve">Served as department SME and technical strategist across a portfolio of capital engineering projects.</w:t>
-      </w:r>
-    </w:p>
-    <w:p>
-      <w:pPr>
-        <w:pStyle w:val="ListParagraph"/>
-        <w:numPr>
-          <w:ilvl w:val="0"/>
-          <w:numId w:val="2"/>
-        </w:numPr>
-        <w:spacing w:after="20"/>
-      </w:pPr>
-      <w:r>
-        <w:rPr>
-          <w:color w:val="1C1B19"/>
-          <w:sz w:val="20"/>
-          <w:szCs w:val="20"/>
-        </w:rPr>
-        <w:t xml:space="preserve">Defined automation strategy from pipeline needs and industry direction, increasingly oriented to data capture, integration, and analytics readiness.</w:t>
-      </w:r>
-    </w:p>
-    <w:p>
-      <w:pPr>
-        <w:pStyle w:val="ListParagraph"/>
-        <w:numPr>
-          <w:ilvl w:val="0"/>
-          <w:numId w:val="2"/>
-        </w:numPr>
-        <w:spacing w:after="20"/>
-      </w:pPr>
-      <w:r>
-        <w:rPr>
-          <w:color w:val="1C1B19"/>
-          <w:sz w:val="20"/>
-          <w:szCs w:val="20"/>
-        </w:rPr>
-        <w:t xml:space="preserve">Led project delivery and mentored the automation team, bridging plant-floor controls with the enterprise data layer.</w:t>
+        <w:t xml:space="preserve">First operating-company role—embedded daily with manufacturing, quality, and validation, shifting from one-off technology deployment to full-lifecycle ownership of systems.</w:t>
+      </w:r>
+    </w:p>
+    <w:p>
+      <w:pPr>
+        <w:pStyle w:val="ListParagraph"/>
+        <w:numPr>
+          <w:ilvl w:val="0"/>
+          <w:numId w:val="2"/>
+        </w:numPr>
+        <w:spacing w:after="20"/>
+      </w:pPr>
+      <w:r>
+        <w:rPr>
+          <w:color w:val="1C1B19"/>
+          <w:sz w:val="20"/>
+          <w:szCs w:val="20"/>
+        </w:rPr>
+        <w:t xml:space="preserve">Closed equipment integration gaps facility-wide—making all equipment integratable, remotely accessible, and maintainable, and onboarding systems into Active Directory to cut the passwords users had to manage.</w:t>
+      </w:r>
+    </w:p>
+    <w:p>
+      <w:pPr>
+        <w:pStyle w:val="ListParagraph"/>
+        <w:numPr>
+          <w:ilvl w:val="0"/>
+          <w:numId w:val="2"/>
+        </w:numPr>
+        <w:spacing w:after="20"/>
+      </w:pPr>
+      <w:r>
+        <w:rPr>
+          <w:color w:val="1C1B19"/>
+          <w:sz w:val="20"/>
+          <w:szCs w:val="20"/>
+        </w:rPr>
+        <w:t xml:space="preserve">Streamlined automation support by launching apps to request, track, and self-resolve issues against a known-issues knowledge base, backed by an internal issue/resolution tracker that sped search and reuse of prior fixes.</w:t>
+      </w:r>
+    </w:p>
+    <w:p>
+      <w:pPr>
+        <w:pStyle w:val="ListParagraph"/>
+        <w:numPr>
+          <w:ilvl w:val="0"/>
+          <w:numId w:val="2"/>
+        </w:numPr>
+        <w:spacing w:after="20"/>
+      </w:pPr>
+      <w:r>
+        <w:rPr>
+          <w:color w:val="1C1B19"/>
+          <w:sz w:val="20"/>
+          <w:szCs w:val="20"/>
+        </w:rPr>
+        <w:t xml:space="preserve">Led development and go-live of a facility-wide alarm management system—all alarms in a single pane of glass with disposition and escalation-based notifications—and a centralized batch reporting engine delivering consistent reports across any vendor or system.</w:t>
+      </w:r>
+    </w:p>
+    <w:p>
+      <w:pPr>
+        <w:pStyle w:val="ListParagraph"/>
+        <w:numPr>
+          <w:ilvl w:val="0"/>
+          <w:numId w:val="2"/>
+        </w:numPr>
+        <w:spacing w:after="20"/>
+      </w:pPr>
+      <w:r>
+        <w:rPr>
+          <w:color w:val="1C1B19"/>
+          <w:sz w:val="20"/>
+          <w:szCs w:val="20"/>
+        </w:rPr>
+        <w:t xml:space="preserve">Ran vendor evaluation, scoring, and selection for an electronic batch record (eBR) system, defining use-case scope, business requirements, and justification through to a recommended plan.</w:t>
       </w:r>
     </w:p>
     <w:p>
@@ -971,7 +1025,7 @@
           <w:sz w:val="20"/>
           <w:szCs w:val="20"/>
         </w:rPr>
-        <w:t xml:space="preserve">Enterprise automation &amp; digital strategy (Thermo Fisher) — department-wide automation and data-capture strategy across a multi-project pipeline.</w:t>
+        <w:t xml:space="preserve">Facility-wide alarm management &amp; centralized batch reporting (Thermo Fisher) — consolidated all facility alarms into a single pane of glass with escalation notifications, and a reporting engine producing consistent batch reports across any vendor or system.</w:t>
       </w:r>
     </w:p>
     <w:p>

</xml_diff>

<commit_message>
Set custom domain martinkockx.org; update résumé link
- Add CNAME so GitHub Pages serves the site at martinkockx.org (apex)
- Point résumé contact link at martinkockx.org and regenerate the .docx

Co-Authored-By: Claude Opus 4.8 <noreply@anthropic.com>
</commit_message>
<xml_diff>
--- a/resume/files/Martin-Kockx-Resume.docx
+++ b/resume/files/Martin-Kockx-Resume.docx
@@ -57,7 +57,7 @@
         </w:rPr>
         <w:t xml:space="preserve">  |  (857) 303-5412  |  </w:t>
       </w:r>
-      <w:hyperlink w:history="1" r:id="rIdm2b5we-4qab5frrrqlgtw">
+      <w:hyperlink w:history="1" r:id="rIdge_irjtxmci_l83ws67ra">
         <w:r>
           <w:rPr>
             <w:color w:val="0E5C5B"/>
@@ -75,7 +75,7 @@
         </w:rPr>
         <w:t xml:space="preserve">  |  </w:t>
       </w:r>
-      <w:hyperlink w:history="1" r:id="rId2zwjksai1i2csomyx4fix">
+      <w:hyperlink w:history="1" r:id="rIdi2es0h_86g1beevfapik6">
         <w:r>
           <w:rPr>
             <w:color w:val="0E5C5B"/>
@@ -93,14 +93,14 @@
         </w:rPr>
         <w:t xml:space="preserve">  |  </w:t>
       </w:r>
-      <w:hyperlink w:history="1" r:id="rIdoglwzgr_yzhl3-vebtnzo">
+      <w:hyperlink w:history="1" r:id="rIdxbgbxt7oupduk0mhnfu8q">
         <w:r>
           <w:rPr>
             <w:color w:val="0E5C5B"/>
             <w:sz w:val="19"/>
             <w:szCs w:val="19"/>
           </w:rPr>
-          <w:t xml:space="preserve">mkockx.github.io</w:t>
+          <w:t xml:space="preserve">martinkockx.org</w:t>
         </w:r>
       </w:hyperlink>
     </w:p>

</xml_diff>